<commit_message>
Zone de la digue : pas de projection derrière l'ouvrage (trop peu d'images depuis les travaux) ; distance actuelle mer – maisons et pire cas ajoutés ; note de concept corrigée
</commit_message>
<xml_diff>
--- a/docs/Note_de_concept_TefesSat.docx
+++ b/docs/Note_de_concept_TefesSat.docx
@@ -2205,7 +2205,17 @@
         <w:t xml:space="preserve">rupture</w:t>
       </w:r>
       <w:r>
-        <w:t xml:space="preserve"> : la projection ne prolonge pas ce saut et ne part que des dates suivantes. Un tronçon sans au moins 4 dates sur 3 ans, avec une mesure récente, est marqué « non évalué ».</w:t>
+        <w:t xml:space="preserve"> : la projection ne prolonge pas ce saut et ne part que des dates suivantes. </w:t>
+      </w:r>
+      <w:r>
+        <w:rPr>
+          <w:b/>
+          <w:bCs/>
+        </w:rPr>
+        <w:t xml:space="preserve">Zone de la digue :</w:t>
+      </w:r>
+      <w:r>
+        <w:t xml:space="preserve"> de Goxu Mbacc au quai de pêche de Guet Ndar, la côte a brusquement avancé pendant les travaux de 2021–2022 ; la projection n’y utilise que les dates postérieures aux travaux. Un tronçon sans au moins 4 dates sur 3 ans, avec une mesure récente, est marqué « non évalué ».</w:t>
       </w:r>
     </w:p>
     <w:p>
@@ -2780,10 +2790,10 @@
         </w:tblBorders>
       </w:tblPr>
       <w:tblGrid>
+        <w:gridCol w:w="2400"/>
+        <w:gridCol w:w="3000"/>
         <w:gridCol w:w="2500"/>
-        <w:gridCol w:w="3300"/>
-        <w:gridCol w:w="2300"/>
-        <w:gridCol w:w="1992"/>
+        <w:gridCol w:w="2192"/>
       </w:tblGrid>
       <w:tr>
         <w:trPr>
@@ -2791,7 +2801,7 @@
         </w:trPr>
         <w:tc>
           <w:tcPr>
-            <w:tcW w:type="dxa" w:w="2500"/>
+            <w:tcW w:type="dxa" w:w="2400"/>
             <w:tcBorders>
               <w:top w:val="single" w:color="CFDCD9" w:sz="4"/>
               <w:left w:val="single" w:color="CFDCD9" w:sz="4"/>
@@ -2821,7 +2831,7 @@
         </w:tc>
         <w:tc>
           <w:tcPr>
-            <w:tcW w:type="dxa" w:w="3300"/>
+            <w:tcW w:type="dxa" w:w="3000"/>
             <w:tcBorders>
               <w:top w:val="single" w:color="CFDCD9" w:sz="4"/>
               <w:left w:val="single" w:color="CFDCD9" w:sz="4"/>
@@ -2851,7 +2861,7 @@
         </w:tc>
         <w:tc>
           <w:tcPr>
-            <w:tcW w:type="dxa" w:w="2300"/>
+            <w:tcW w:type="dxa" w:w="2500"/>
             <w:tcBorders>
               <w:top w:val="single" w:color="CFDCD9" w:sz="4"/>
               <w:left w:val="single" w:color="CFDCD9" w:sz="4"/>
@@ -2881,7 +2891,7 @@
         </w:tc>
         <w:tc>
           <w:tcPr>
-            <w:tcW w:type="dxa" w:w="1992"/>
+            <w:tcW w:type="dxa" w:w="2192"/>
             <w:tcBorders>
               <w:top w:val="single" w:color="CFDCD9" w:sz="4"/>
               <w:left w:val="single" w:color="CFDCD9" w:sz="4"/>
@@ -2916,6 +2926,64 @@
         </w:trPr>
         <w:tc>
           <w:tcPr>
+            <w:tcW w:type="dxa" w:w="2400"/>
+            <w:tcBorders>
+              <w:top w:val="single" w:color="CFDCD9" w:sz="4"/>
+              <w:left w:val="single" w:color="CFDCD9" w:sz="4"/>
+              <w:bottom w:val="single" w:color="CFDCD9" w:sz="4"/>
+              <w:right w:val="single" w:color="CFDCD9" w:sz="4"/>
+            </w:tcBorders>
+            <w:tcMar>
+              <w:top w:type="dxa" w:w="50"/>
+              <w:left w:type="dxa" w:w="90"/>
+              <w:bottom w:type="dxa" w:w="50"/>
+              <w:right w:type="dxa" w:w="90"/>
+            </w:tcMar>
+          </w:tcPr>
+          <w:p>
+            <w:pPr>
+              <w:jc w:val="left"/>
+            </w:pPr>
+            <w:r>
+              <w:rPr>
+                <w:sz w:val="19"/>
+                <w:szCs w:val="19"/>
+              </w:rPr>
+              <w:t xml:space="preserve">Hydrobase sud</w:t>
+            </w:r>
+          </w:p>
+        </w:tc>
+        <w:tc>
+          <w:tcPr>
+            <w:tcW w:type="dxa" w:w="3000"/>
+            <w:tcBorders>
+              <w:top w:val="single" w:color="CFDCD9" w:sz="4"/>
+              <w:left w:val="single" w:color="CFDCD9" w:sz="4"/>
+              <w:bottom w:val="single" w:color="CFDCD9" w:sz="4"/>
+              <w:right w:val="single" w:color="CFDCD9" w:sz="4"/>
+            </w:tcBorders>
+            <w:tcMar>
+              <w:top w:type="dxa" w:w="50"/>
+              <w:left w:type="dxa" w:w="90"/>
+              <w:bottom w:type="dxa" w:w="50"/>
+              <w:right w:type="dxa" w:w="90"/>
+            </w:tcMar>
+          </w:tcPr>
+          <w:p>
+            <w:pPr>
+              <w:jc w:val="left"/>
+            </w:pPr>
+            <w:r>
+              <w:rPr>
+                <w:sz w:val="19"/>
+                <w:szCs w:val="19"/>
+              </w:rPr>
+              <w:t xml:space="preserve">Recul de 6 à 7,5 m/an</w:t>
+            </w:r>
+          </w:p>
+        </w:tc>
+        <w:tc>
+          <w:tcPr>
             <w:tcW w:type="dxa" w:w="2500"/>
             <w:tcBorders>
               <w:top w:val="single" w:color="CFDCD9" w:sz="4"/>
@@ -2939,71 +3007,13 @@
                 <w:sz w:val="19"/>
                 <w:szCs w:val="19"/>
               </w:rPr>
-              <w:t xml:space="preserve">Hydrobase sud</w:t>
-            </w:r>
-          </w:p>
-        </w:tc>
-        <w:tc>
-          <w:tcPr>
-            <w:tcW w:type="dxa" w:w="3300"/>
-            <w:tcBorders>
-              <w:top w:val="single" w:color="CFDCD9" w:sz="4"/>
-              <w:left w:val="single" w:color="CFDCD9" w:sz="4"/>
-              <w:bottom w:val="single" w:color="CFDCD9" w:sz="4"/>
-              <w:right w:val="single" w:color="CFDCD9" w:sz="4"/>
-            </w:tcBorders>
-            <w:tcMar>
-              <w:top w:type="dxa" w:w="50"/>
-              <w:left w:type="dxa" w:w="90"/>
-              <w:bottom w:type="dxa" w:w="50"/>
-              <w:right w:type="dxa" w:w="90"/>
-            </w:tcMar>
-          </w:tcPr>
-          <w:p>
-            <w:pPr>
-              <w:jc w:val="left"/>
-            </w:pPr>
-            <w:r>
-              <w:rPr>
-                <w:sz w:val="19"/>
-                <w:szCs w:val="19"/>
-              </w:rPr>
-              <w:t xml:space="preserve">Recul de 6 à 7,5 m/an</w:t>
-            </w:r>
-          </w:p>
-        </w:tc>
-        <w:tc>
-          <w:tcPr>
-            <w:tcW w:type="dxa" w:w="2300"/>
-            <w:tcBorders>
-              <w:top w:val="single" w:color="CFDCD9" w:sz="4"/>
-              <w:left w:val="single" w:color="CFDCD9" w:sz="4"/>
-              <w:bottom w:val="single" w:color="CFDCD9" w:sz="4"/>
-              <w:right w:val="single" w:color="CFDCD9" w:sz="4"/>
-            </w:tcBorders>
-            <w:tcMar>
-              <w:top w:type="dxa" w:w="50"/>
-              <w:left w:type="dxa" w:w="90"/>
-              <w:bottom w:type="dxa" w:w="50"/>
-              <w:right w:type="dxa" w:w="90"/>
-            </w:tcMar>
-          </w:tcPr>
-          <w:p>
-            <w:pPr>
-              <w:jc w:val="left"/>
-            </w:pPr>
-            <w:r>
-              <w:rPr>
-                <w:sz w:val="19"/>
-                <w:szCs w:val="19"/>
-              </w:rPr>
-              <w:t xml:space="preserve">≈ 75 m</w:t>
-            </w:r>
-          </w:p>
-        </w:tc>
-        <w:tc>
-          <w:tcPr>
-            <w:tcW w:type="dxa" w:w="1992"/>
+              <w:t xml:space="preserve">≈ 75 m (pire cas : ≈ 18 m)</w:t>
+            </w:r>
+          </w:p>
+        </w:tc>
+        <w:tc>
+          <w:tcPr>
+            <w:tcW w:type="dxa" w:w="2192"/>
             <w:tcBorders>
               <w:top w:val="single" w:color="CFDCD9" w:sz="4"/>
               <w:left w:val="single" w:color="CFDCD9" w:sz="4"/>
@@ -3035,7 +3045,7 @@
                 <w:sz w:val="19"/>
                 <w:szCs w:val="19"/>
               </w:rPr>
-              <w:t xml:space="preserve"> (± 35 m)</w:t>
+              <w:t xml:space="preserve"> ; dans le pire cas, des maisons peuvent être atteintes</w:t>
             </w:r>
           </w:p>
         </w:tc>
@@ -3046,6 +3056,66 @@
         </w:trPr>
         <w:tc>
           <w:tcPr>
+            <w:tcW w:type="dxa" w:w="2400"/>
+            <w:tcBorders>
+              <w:top w:val="single" w:color="CFDCD9" w:sz="4"/>
+              <w:left w:val="single" w:color="CFDCD9" w:sz="4"/>
+              <w:bottom w:val="single" w:color="CFDCD9" w:sz="4"/>
+              <w:right w:val="single" w:color="CFDCD9" w:sz="4"/>
+            </w:tcBorders>
+            <w:shd w:fill="F5F9F8" w:color="auto" w:val="clear"/>
+            <w:tcMar>
+              <w:top w:type="dxa" w:w="50"/>
+              <w:left w:type="dxa" w:w="90"/>
+              <w:bottom w:type="dxa" w:w="50"/>
+              <w:right w:type="dxa" w:w="90"/>
+            </w:tcMar>
+          </w:tcPr>
+          <w:p>
+            <w:pPr>
+              <w:jc w:val="left"/>
+            </w:pPr>
+            <w:r>
+              <w:rPr>
+                <w:sz w:val="19"/>
+                <w:szCs w:val="19"/>
+              </w:rPr>
+              <w:t xml:space="preserve">Guéthie – Tassinère (face à la brèche)</w:t>
+            </w:r>
+          </w:p>
+        </w:tc>
+        <w:tc>
+          <w:tcPr>
+            <w:tcW w:type="dxa" w:w="3000"/>
+            <w:tcBorders>
+              <w:top w:val="single" w:color="CFDCD9" w:sz="4"/>
+              <w:left w:val="single" w:color="CFDCD9" w:sz="4"/>
+              <w:bottom w:val="single" w:color="CFDCD9" w:sz="4"/>
+              <w:right w:val="single" w:color="CFDCD9" w:sz="4"/>
+            </w:tcBorders>
+            <w:shd w:fill="F5F9F8" w:color="auto" w:val="clear"/>
+            <w:tcMar>
+              <w:top w:type="dxa" w:w="50"/>
+              <w:left w:type="dxa" w:w="90"/>
+              <w:bottom w:type="dxa" w:w="50"/>
+              <w:right w:type="dxa" w:w="90"/>
+            </w:tcMar>
+          </w:tcPr>
+          <w:p>
+            <w:pPr>
+              <w:jc w:val="left"/>
+            </w:pPr>
+            <w:r>
+              <w:rPr>
+                <w:sz w:val="19"/>
+                <w:szCs w:val="19"/>
+              </w:rPr>
+              <w:t xml:space="preserve">Rupture entre 2019 et 2021 (la langue de sable disparaît), puis recul de 20 à 60 m/an</w:t>
+            </w:r>
+          </w:p>
+        </w:tc>
+        <w:tc>
+          <w:tcPr>
             <w:tcW w:type="dxa" w:w="2500"/>
             <w:tcBorders>
               <w:top w:val="single" w:color="CFDCD9" w:sz="4"/>
@@ -3070,73 +3140,13 @@
                 <w:sz w:val="19"/>
                 <w:szCs w:val="19"/>
               </w:rPr>
-              <w:t xml:space="preserve">Guéthie – Tassinère (face à la brèche)</w:t>
-            </w:r>
-          </w:p>
-        </w:tc>
-        <w:tc>
-          <w:tcPr>
-            <w:tcW w:type="dxa" w:w="3300"/>
-            <w:tcBorders>
-              <w:top w:val="single" w:color="CFDCD9" w:sz="4"/>
-              <w:left w:val="single" w:color="CFDCD9" w:sz="4"/>
-              <w:bottom w:val="single" w:color="CFDCD9" w:sz="4"/>
-              <w:right w:val="single" w:color="CFDCD9" w:sz="4"/>
-            </w:tcBorders>
-            <w:shd w:fill="F5F9F8" w:color="auto" w:val="clear"/>
-            <w:tcMar>
-              <w:top w:type="dxa" w:w="50"/>
-              <w:left w:type="dxa" w:w="90"/>
-              <w:bottom w:type="dxa" w:w="50"/>
-              <w:right w:type="dxa" w:w="90"/>
-            </w:tcMar>
-          </w:tcPr>
-          <w:p>
-            <w:pPr>
-              <w:jc w:val="left"/>
-            </w:pPr>
-            <w:r>
-              <w:rPr>
-                <w:sz w:val="19"/>
-                <w:szCs w:val="19"/>
-              </w:rPr>
-              <w:t xml:space="preserve">Rupture entre 2019 et 2021 (la langue de sable disparaît), puis recul de 20 à 60 m/an</w:t>
-            </w:r>
-          </w:p>
-        </w:tc>
-        <w:tc>
-          <w:tcPr>
-            <w:tcW w:type="dxa" w:w="2300"/>
-            <w:tcBorders>
-              <w:top w:val="single" w:color="CFDCD9" w:sz="4"/>
-              <w:left w:val="single" w:color="CFDCD9" w:sz="4"/>
-              <w:bottom w:val="single" w:color="CFDCD9" w:sz="4"/>
-              <w:right w:val="single" w:color="CFDCD9" w:sz="4"/>
-            </w:tcBorders>
-            <w:shd w:fill="F5F9F8" w:color="auto" w:val="clear"/>
-            <w:tcMar>
-              <w:top w:type="dxa" w:w="50"/>
-              <w:left w:type="dxa" w:w="90"/>
-              <w:bottom w:type="dxa" w:w="50"/>
-              <w:right w:type="dxa" w:w="90"/>
-            </w:tcMar>
-          </w:tcPr>
-          <w:p>
-            <w:pPr>
-              <w:jc w:val="left"/>
-            </w:pPr>
-            <w:r>
-              <w:rPr>
-                <w:sz w:val="19"/>
-                <w:szCs w:val="19"/>
-              </w:rPr>
-              <w:t xml:space="preserve">≈ 200 m</w:t>
-            </w:r>
-          </w:p>
-        </w:tc>
-        <w:tc>
-          <w:tcPr>
-            <w:tcW w:type="dxa" w:w="1992"/>
+              <w:t xml:space="preserve">≈ 200 m, mais projection très incertaine : dans le pire cas, maisons atteintes dès 2030</w:t>
+            </w:r>
+          </w:p>
+        </w:tc>
+        <w:tc>
+          <w:tcPr>
+            <w:tcW w:type="dxa" w:w="2192"/>
             <w:tcBorders>
               <w:top w:val="single" w:color="CFDCD9" w:sz="4"/>
               <w:left w:val="single" w:color="CFDCD9" w:sz="4"/>
@@ -3180,6 +3190,64 @@
         </w:trPr>
         <w:tc>
           <w:tcPr>
+            <w:tcW w:type="dxa" w:w="2400"/>
+            <w:tcBorders>
+              <w:top w:val="single" w:color="CFDCD9" w:sz="4"/>
+              <w:left w:val="single" w:color="CFDCD9" w:sz="4"/>
+              <w:bottom w:val="single" w:color="CFDCD9" w:sz="4"/>
+              <w:right w:val="single" w:color="CFDCD9" w:sz="4"/>
+            </w:tcBorders>
+            <w:tcMar>
+              <w:top w:type="dxa" w:w="50"/>
+              <w:left w:type="dxa" w:w="90"/>
+              <w:bottom w:type="dxa" w:w="50"/>
+              <w:right w:type="dxa" w:w="90"/>
+            </w:tcMar>
+          </w:tcPr>
+          <w:p>
+            <w:pPr>
+              <w:jc w:val="left"/>
+            </w:pPr>
+            <w:r>
+              <w:rPr>
+                <w:sz w:val="19"/>
+                <w:szCs w:val="19"/>
+              </w:rPr>
+              <w:t xml:space="preserve">Guet Ndar, Ndar Toute, Santhiaba, Goxu Mbacc (zone de la digue)</w:t>
+            </w:r>
+          </w:p>
+        </w:tc>
+        <w:tc>
+          <w:tcPr>
+            <w:tcW w:type="dxa" w:w="3000"/>
+            <w:tcBorders>
+              <w:top w:val="single" w:color="CFDCD9" w:sz="4"/>
+              <w:left w:val="single" w:color="CFDCD9" w:sz="4"/>
+              <w:bottom w:val="single" w:color="CFDCD9" w:sz="4"/>
+              <w:right w:val="single" w:color="CFDCD9" w:sz="4"/>
+            </w:tcBorders>
+            <w:tcMar>
+              <w:top w:type="dxa" w:w="50"/>
+              <w:left w:type="dxa" w:w="90"/>
+              <w:bottom w:type="dxa" w:w="50"/>
+              <w:right w:type="dxa" w:w="90"/>
+            </w:tcMar>
+          </w:tcPr>
+          <w:p>
+            <w:pPr>
+              <w:jc w:val="left"/>
+            </w:pPr>
+            <w:r>
+              <w:rPr>
+                <w:sz w:val="19"/>
+                <w:szCs w:val="19"/>
+              </w:rPr>
+              <w:t xml:space="preserve">Avancée de la plage pendant les travaux ; trop peu d’images depuis pour projeter</w:t>
+            </w:r>
+          </w:p>
+        </w:tc>
+        <w:tc>
+          <w:tcPr>
             <w:tcW w:type="dxa" w:w="2500"/>
             <w:tcBorders>
               <w:top w:val="single" w:color="CFDCD9" w:sz="4"/>
@@ -3203,94 +3271,36 @@
                 <w:sz w:val="19"/>
                 <w:szCs w:val="19"/>
               </w:rPr>
-              <w:t xml:space="preserve">Guet Ndar, Ndar Toute, Santhiaba</w:t>
-            </w:r>
-          </w:p>
-        </w:tc>
-        <w:tc>
-          <w:tcPr>
-            <w:tcW w:type="dxa" w:w="3300"/>
-            <w:tcBorders>
-              <w:top w:val="single" w:color="CFDCD9" w:sz="4"/>
-              <w:left w:val="single" w:color="CFDCD9" w:sz="4"/>
-              <w:bottom w:val="single" w:color="CFDCD9" w:sz="4"/>
-              <w:right w:val="single" w:color="CFDCD9" w:sz="4"/>
-            </w:tcBorders>
-            <w:tcMar>
-              <w:top w:type="dxa" w:w="50"/>
-              <w:left w:type="dxa" w:w="90"/>
-              <w:bottom w:type="dxa" w:w="50"/>
-              <w:right w:type="dxa" w:w="90"/>
-            </w:tcMar>
-          </w:tcPr>
-          <w:p>
-            <w:pPr>
-              <w:jc w:val="left"/>
-            </w:pPr>
-            <w:r>
-              <w:rPr>
-                <w:sz w:val="19"/>
-                <w:szCs w:val="19"/>
-              </w:rPr>
-              <w:t xml:space="preserve">Avancée de 9 à 11 m/an (effet de la digue)</w:t>
-            </w:r>
-          </w:p>
-        </w:tc>
-        <w:tc>
-          <w:tcPr>
-            <w:tcW w:type="dxa" w:w="2300"/>
-            <w:tcBorders>
-              <w:top w:val="single" w:color="CFDCD9" w:sz="4"/>
-              <w:left w:val="single" w:color="CFDCD9" w:sz="4"/>
-              <w:bottom w:val="single" w:color="CFDCD9" w:sz="4"/>
-              <w:right w:val="single" w:color="CFDCD9" w:sz="4"/>
-            </w:tcBorders>
-            <w:tcMar>
-              <w:top w:type="dxa" w:w="50"/>
-              <w:left w:type="dxa" w:w="90"/>
-              <w:bottom w:type="dxa" w:w="50"/>
-              <w:right w:type="dxa" w:w="90"/>
-            </w:tcMar>
-          </w:tcPr>
-          <w:p>
-            <w:pPr>
-              <w:jc w:val="left"/>
-            </w:pPr>
-            <w:r>
-              <w:rPr>
-                <w:sz w:val="19"/>
-                <w:szCs w:val="19"/>
-              </w:rPr>
-              <w:t xml:space="preserve">≈ 130 m</w:t>
-            </w:r>
-          </w:p>
-        </w:tc>
-        <w:tc>
-          <w:tcPr>
-            <w:tcW w:type="dxa" w:w="1992"/>
-            <w:tcBorders>
-              <w:top w:val="single" w:color="CFDCD9" w:sz="4"/>
-              <w:left w:val="single" w:color="CFDCD9" w:sz="4"/>
-              <w:bottom w:val="single" w:color="CFDCD9" w:sz="4"/>
-              <w:right w:val="single" w:color="CFDCD9" w:sz="4"/>
-            </w:tcBorders>
-            <w:tcMar>
-              <w:top w:type="dxa" w:w="50"/>
-              <w:left w:type="dxa" w:w="90"/>
-              <w:bottom w:type="dxa" w:w="50"/>
-              <w:right w:type="dxa" w:w="90"/>
-            </w:tcMar>
-          </w:tcPr>
-          <w:p>
-            <w:pPr>
-              <w:jc w:val="left"/>
-            </w:pPr>
-            <w:r>
-              <w:rPr>
-                <w:sz w:val="19"/>
-                <w:szCs w:val="19"/>
-              </w:rPr>
-              <w:t xml:space="preserve">≈ 175 m</w:t>
+              <w:t xml:space="preserve">Non projeté. Aujourd’hui (2025) : 70 à 90 m entre la mer et les premières maisons</w:t>
+            </w:r>
+          </w:p>
+        </w:tc>
+        <w:tc>
+          <w:tcPr>
+            <w:tcW w:type="dxa" w:w="2192"/>
+            <w:tcBorders>
+              <w:top w:val="single" w:color="CFDCD9" w:sz="4"/>
+              <w:left w:val="single" w:color="CFDCD9" w:sz="4"/>
+              <w:bottom w:val="single" w:color="CFDCD9" w:sz="4"/>
+              <w:right w:val="single" w:color="CFDCD9" w:sz="4"/>
+            </w:tcBorders>
+            <w:tcMar>
+              <w:top w:type="dxa" w:w="50"/>
+              <w:left w:type="dxa" w:w="90"/>
+              <w:bottom w:type="dxa" w:w="50"/>
+              <w:right w:type="dxa" w:w="90"/>
+            </w:tcMar>
+          </w:tcPr>
+          <w:p>
+            <w:pPr>
+              <w:jc w:val="left"/>
+            </w:pPr>
+            <w:r>
+              <w:rPr>
+                <w:sz w:val="19"/>
+                <w:szCs w:val="19"/>
+              </w:rPr>
+              <w:t xml:space="preserve">Non projeté</w:t>
             </w:r>
           </w:p>
         </w:tc>
@@ -3326,7 +3336,7 @@
         <w:t xml:space="preserve">marge</w:t>
       </w:r>
       <w:r>
-        <w:t xml:space="preserve"> : environ 10 m à Guéthie et 50 m à Hydrobase en 2035.</w:t>
+        <w:t xml:space="preserve"> : environ 10 m à Guéthie et 50 m à Hydrobase en 2035. Le « pire cas » retire de la marge l’incertitude de la projection à 95 %.</w:t>
       </w:r>
     </w:p>
     <w:p>
@@ -3460,7 +3470,7 @@
         <w:t xml:space="preserve">Projection :</w:t>
       </w:r>
       <w:r>
-        <w:t xml:space="preserve"> elle prolonge la tendance actuelle ; elle s’arrête à 2035 et ne prédit pas une tempête. 43 tronçons sont « non évalués » plutôt que de donner un chiffre faux.</w:t>
+        <w:t xml:space="preserve"> elle prolonge la tendance actuelle ; elle s’arrête à 2035 et ne prédit pas une tempête. Sa marge d’erreur est d’environ ± 35 m en 2030 sur la plupart des secteurs, mais de plusieurs centaines de mètres face à la brèche. 154 tronçons sur 712 sont « non évalués » plutôt que de donner un chiffre faux : 111 dans la zone influencée par la digue (pas assez d’images depuis les travaux) et 43 dont la série est trop courte.</w:t>
       </w:r>
     </w:p>
     <w:p>

</xml_diff>

<commit_message>
Historique de la côte pour le tableau de bord (positions par année et par date) ; rangement des fichiers d'Abdoulaye ; sa carte avant / après dans la note de concept
</commit_message>
<xml_diff>
--- a/docs/Note_de_concept_TefesSat.docx
+++ b/docs/Note_de_concept_TefesSat.docx
@@ -3619,23 +3619,64 @@
     </w:p>
     <w:p>
       <w:pPr>
-        <w:pBdr>
-          <w:top w:val="dashed" w:color="0B7A6F" w:sz="12" w:space="8"/>
-          <w:bottom w:val="dashed" w:color="0B7A6F" w:sz="12" w:space="8"/>
-          <w:left w:val="dashed" w:color="0B7A6F" w:sz="12" w:space="8"/>
-          <w:right w:val="dashed" w:color="0B7A6F" w:sz="12" w:space="8"/>
-        </w:pBdr>
-        <w:shd w:fill="E6F3F1" w:color="auto" w:val="clear"/>
-        <w:spacing w:before="120" w:after="120"/>
+        <w:keepNext/>
         <w:jc w:val="center"/>
       </w:pPr>
       <w:r>
-        <w:rPr>
-          <w:b/>
-          <w:bCs/>
-          <w:color w:val="0B7A6F"/>
-        </w:rPr>
-        <w:t xml:space="preserve">Figure 2 – Carte avant / après (2016 et 2025) – à insérer : carte réalisée par Abdoulaye DIOUF.</w:t>
+        <w:drawing>
+          <wp:inline distT="0" distB="0" distL="0" distR="0">
+            <wp:extent cx="5715000" cy="4352925"/>
+            <wp:effectExtent t="0" r="0" b="0" l="0"/>
+            <wp:docPr id="1" name="" descr="" title=""/>
+            <wp:cNvGraphicFramePr>
+              <a:graphicFrameLocks xmlns:a="http://schemas.openxmlformats.org/drawingml/2006/main" noChangeAspect="1"/>
+            </wp:cNvGraphicFramePr>
+            <a:graphic xmlns:a="http://schemas.openxmlformats.org/drawingml/2006/main">
+              <a:graphicData uri="http://schemas.openxmlformats.org/drawingml/2006/picture">
+                <pic:pic xmlns:pic="http://schemas.openxmlformats.org/drawingml/2006/picture">
+                  <pic:nvPicPr>
+                    <pic:cNvPr id="0" name="" descr=""/>
+                    <pic:cNvPicPr>
+                      <a:picLocks noChangeAspect="1" noChangeArrowheads="1"/>
+                    </pic:cNvPicPr>
+                  </pic:nvPicPr>
+                  <pic:blipFill>
+                    <a:blip r:embed="rId7" cstate="none"/>
+                    <a:srcRect/>
+                    <a:stretch>
+                      <a:fillRect/>
+                    </a:stretch>
+                  </pic:blipFill>
+                  <pic:spPr bwMode="auto">
+                    <a:xfrm>
+                      <a:off x="0" y="0"/>
+                      <a:ext cx="5715000" cy="4352925"/>
+                    </a:xfrm>
+                    <a:prstGeom prst="rect">
+                      <a:avLst/>
+                    </a:prstGeom>
+                  </pic:spPr>
+                </pic:pic>
+              </a:graphicData>
+            </a:graphic>
+          </wp:inline>
+        </w:drawing>
+      </w:r>
+    </w:p>
+    <w:p>
+      <w:pPr>
+        <w:spacing w:after="120"/>
+        <w:jc w:val="center"/>
+      </w:pPr>
+      <w:r>
+        <w:rPr>
+          <w:i/>
+          <w:iCs/>
+          <w:color w:val="5A6B70"/>
+          <w:sz w:val="18"/>
+          <w:szCs w:val="18"/>
+        </w:rPr>
+        <w:t xml:space="preserve">Figure 2 – Trait de côte en 2015 (bleu) et en 2025 (noir), du sud d’Hydrobase (tronçon 1) à Goxu Mbacc (tronçon 5) : en rouge la terre perdue au sud, en vert la plage gagnée derrière la digue. Sentinel-2, CoastSat (Abdoulaye DIOUF).</w:t>
       </w:r>
     </w:p>
     <w:p>

</xml_diff>